<commit_message>
Add MLOps architecture diagram to report
</commit_message>
<xml_diff>
--- a/reports/heart_disease_mlops_report.docx
+++ b/reports/heart_disease_mlops_report.docx
@@ -1370,6 +1370,70 @@
         <w:t>The screenshots referenced in this report are maintained under the repository's screenshots/ directory. The EDA and confusion-matrix figures are maintained under reports/figures/. Consult README.md for exact commands, configuration, and local deployment instructions.</w:t>
       </w:r>
     </w:p>
+    <w:p>
+      <w:pPr>
+        <w:pStyle w:val="Heading1"/>
+      </w:pPr>
+      <w:r>
+        <w:t>Architecture</w:t>
+      </w:r>
+    </w:p>
+    <w:p>
+      <w:r>
+        <w:t>The diagram below summarizes the data, training, experiment tracking, API serving, CI/CD, container deployment and monitoring workflow.</w:t>
+      </w:r>
+    </w:p>
+    <w:p>
+      <w:pPr>
+        <w:jc w:val="center"/>
+      </w:pPr>
+      <w:r>
+        <w:drawing>
+          <wp:inline xmlns:a="http://schemas.openxmlformats.org/drawingml/2006/main" xmlns:pic="http://schemas.openxmlformats.org/drawingml/2006/picture">
+            <wp:extent cx="5486400" cy="2811780"/>
+            <wp:docPr id="17" name="Picture 17"/>
+            <wp:cNvGraphicFramePr>
+              <a:graphicFrameLocks noChangeAspect="1"/>
+            </wp:cNvGraphicFramePr>
+            <a:graphic>
+              <a:graphicData uri="http://schemas.openxmlformats.org/drawingml/2006/picture">
+                <pic:pic>
+                  <pic:nvPicPr>
+                    <pic:cNvPr id="0" name="architecture_diagram.png"/>
+                    <pic:cNvPicPr/>
+                  </pic:nvPicPr>
+                  <pic:blipFill>
+                    <a:blip r:embed="rId26"/>
+                    <a:stretch>
+                      <a:fillRect/>
+                    </a:stretch>
+                  </pic:blipFill>
+                  <pic:spPr>
+                    <a:xfrm>
+                      <a:off x="0" y="0"/>
+                      <a:ext cx="5486400" cy="2811780"/>
+                    </a:xfrm>
+                    <a:prstGeom prst="rect"/>
+                  </pic:spPr>
+                </pic:pic>
+              </a:graphicData>
+            </a:graphic>
+          </wp:inline>
+        </w:drawing>
+      </w:r>
+    </w:p>
+    <w:p>
+      <w:pPr>
+        <w:jc w:val="center"/>
+      </w:pPr>
+      <w:r>
+        <w:rPr>
+          <w:i/>
+          <w:sz w:val="18"/>
+        </w:rPr>
+        <w:t>Figure 17. End-to-end architecture of the implemented MLOps workflow.</w:t>
+      </w:r>
+    </w:p>
     <w:sectPr>
       <w:footerReference w:type="default" r:id="rId9"/>
       <w:pgSz w:w="12240" w:h="15840"/>

</xml_diff>

<commit_message>
Update MLOps assignment report
</commit_message>
<xml_diff>
--- a/reports/heart_disease_mlops_report.docx
+++ b/reports/heart_disease_mlops_report.docx
@@ -64,12 +64,76 @@
         <w:jc w:val="center"/>
       </w:pPr>
       <w:r>
-        <w:t>Prepared: 19 October 2026</w:t>
+        <w:t>Prepared: 20 October 2026</w:t>
       </w:r>
     </w:p>
     <w:p>
       <w:r>
         <w:br w:type="page"/>
+      </w:r>
+    </w:p>
+    <w:p>
+      <w:pPr>
+        <w:pStyle w:val="Heading1"/>
+      </w:pPr>
+      <w:r>
+        <w:t>Architecture</w:t>
+      </w:r>
+    </w:p>
+    <w:p>
+      <w:r>
+        <w:t>The diagram summarizes the data, training, experiment tracking, API serving, CI/CD, container deployment and monitoring workflow.</w:t>
+      </w:r>
+    </w:p>
+    <w:p>
+      <w:pPr>
+        <w:jc w:val="center"/>
+      </w:pPr>
+      <w:r>
+        <w:drawing>
+          <wp:inline xmlns:a="http://schemas.openxmlformats.org/drawingml/2006/main" xmlns:pic="http://schemas.openxmlformats.org/drawingml/2006/picture">
+            <wp:extent cx="5486400" cy="2811780"/>
+            <wp:docPr id="1" name="Picture 1"/>
+            <wp:cNvGraphicFramePr>
+              <a:graphicFrameLocks noChangeAspect="1"/>
+            </wp:cNvGraphicFramePr>
+            <a:graphic>
+              <a:graphicData uri="http://schemas.openxmlformats.org/drawingml/2006/picture">
+                <pic:pic>
+                  <pic:nvPicPr>
+                    <pic:cNvPr id="0" name="architecture_diagram.png"/>
+                    <pic:cNvPicPr/>
+                  </pic:nvPicPr>
+                  <pic:blipFill>
+                    <a:blip r:embed="rId10"/>
+                    <a:stretch>
+                      <a:fillRect/>
+                    </a:stretch>
+                  </pic:blipFill>
+                  <pic:spPr>
+                    <a:xfrm>
+                      <a:off x="0" y="0"/>
+                      <a:ext cx="5486400" cy="2811780"/>
+                    </a:xfrm>
+                    <a:prstGeom prst="rect"/>
+                  </pic:spPr>
+                </pic:pic>
+              </a:graphicData>
+            </a:graphic>
+          </wp:inline>
+        </w:drawing>
+      </w:r>
+    </w:p>
+    <w:p>
+      <w:pPr>
+        <w:jc w:val="center"/>
+      </w:pPr>
+      <w:r>
+        <w:rPr>
+          <w:i/>
+          <w:sz w:val="18"/>
+        </w:rPr>
+        <w:t>Figure 1. End-to-end architecture of the implemented MLOps workflow.</w:t>
       </w:r>
     </w:p>
     <w:p>
@@ -129,7 +193,7 @@
         <w:drawing>
           <wp:inline xmlns:a="http://schemas.openxmlformats.org/drawingml/2006/main" xmlns:pic="http://schemas.openxmlformats.org/drawingml/2006/picture">
             <wp:extent cx="5303520" cy="3314700"/>
-            <wp:docPr id="1" name="Picture 1"/>
+            <wp:docPr id="2" name="Picture 2"/>
             <wp:cNvGraphicFramePr>
               <a:graphicFrameLocks noChangeAspect="1"/>
             </wp:cNvGraphicFramePr>
@@ -141,7 +205,7 @@
                     <pic:cNvPicPr/>
                   </pic:nvPicPr>
                   <pic:blipFill>
-                    <a:blip r:embed="rId10"/>
+                    <a:blip r:embed="rId11"/>
                     <a:stretch>
                       <a:fillRect/>
                     </a:stretch>
@@ -169,7 +233,7 @@
           <w:i/>
           <w:sz w:val="18"/>
         </w:rPr>
-        <w:t>Figure 1. Distribution of the original target values.</w:t>
+        <w:t>Figure 2. Distribution of the original target values.</w:t>
       </w:r>
     </w:p>
     <w:p>
@@ -180,7 +244,7 @@
         <w:drawing>
           <wp:inline xmlns:a="http://schemas.openxmlformats.org/drawingml/2006/main" xmlns:pic="http://schemas.openxmlformats.org/drawingml/2006/picture">
             <wp:extent cx="5303520" cy="3788229"/>
-            <wp:docPr id="2" name="Picture 2"/>
+            <wp:docPr id="3" name="Picture 3"/>
             <wp:cNvGraphicFramePr>
               <a:graphicFrameLocks noChangeAspect="1"/>
             </wp:cNvGraphicFramePr>
@@ -192,7 +256,7 @@
                     <pic:cNvPicPr/>
                   </pic:nvPicPr>
                   <pic:blipFill>
-                    <a:blip r:embed="rId11"/>
+                    <a:blip r:embed="rId12"/>
                     <a:stretch>
                       <a:fillRect/>
                     </a:stretch>
@@ -220,7 +284,7 @@
           <w:i/>
           <w:sz w:val="18"/>
         </w:rPr>
-        <w:t>Figure 2. Class balance after binary target conversion.</w:t>
+        <w:t>Figure 3. Class balance after binary target conversion.</w:t>
       </w:r>
     </w:p>
     <w:p>
@@ -244,7 +308,7 @@
         <w:drawing>
           <wp:inline xmlns:a="http://schemas.openxmlformats.org/drawingml/2006/main" xmlns:pic="http://schemas.openxmlformats.org/drawingml/2006/picture">
             <wp:extent cx="5303520" cy="3977640"/>
-            <wp:docPr id="3" name="Picture 3"/>
+            <wp:docPr id="4" name="Picture 4"/>
             <wp:cNvGraphicFramePr>
               <a:graphicFrameLocks noChangeAspect="1"/>
             </wp:cNvGraphicFramePr>
@@ -256,7 +320,7 @@
                     <pic:cNvPicPr/>
                   </pic:nvPicPr>
                   <pic:blipFill>
-                    <a:blip r:embed="rId12"/>
+                    <a:blip r:embed="rId13"/>
                     <a:stretch>
                       <a:fillRect/>
                     </a:stretch>
@@ -284,7 +348,7 @@
           <w:i/>
           <w:sz w:val="18"/>
         </w:rPr>
-        <w:t>Figure 3. Histograms of numeric feature distributions.</w:t>
+        <w:t>Figure 4. Histograms of numeric feature distributions.</w:t>
       </w:r>
     </w:p>
     <w:p>
@@ -295,7 +359,7 @@
         <w:drawing>
           <wp:inline xmlns:a="http://schemas.openxmlformats.org/drawingml/2006/main" xmlns:pic="http://schemas.openxmlformats.org/drawingml/2006/picture">
             <wp:extent cx="5303520" cy="4545874"/>
-            <wp:docPr id="4" name="Picture 4"/>
+            <wp:docPr id="5" name="Picture 5"/>
             <wp:cNvGraphicFramePr>
               <a:graphicFrameLocks noChangeAspect="1"/>
             </wp:cNvGraphicFramePr>
@@ -307,7 +371,7 @@
                     <pic:cNvPicPr/>
                   </pic:nvPicPr>
                   <pic:blipFill>
-                    <a:blip r:embed="rId13"/>
+                    <a:blip r:embed="rId14"/>
                     <a:stretch>
                       <a:fillRect/>
                     </a:stretch>
@@ -335,7 +399,7 @@
           <w:i/>
           <w:sz w:val="18"/>
         </w:rPr>
-        <w:t>Figure 4. Distributions of categorical features.</w:t>
+        <w:t>Figure 5. Distributions of categorical features.</w:t>
       </w:r>
     </w:p>
     <w:p>
@@ -346,7 +410,7 @@
         <w:drawing>
           <wp:inline xmlns:a="http://schemas.openxmlformats.org/drawingml/2006/main" xmlns:pic="http://schemas.openxmlformats.org/drawingml/2006/picture">
             <wp:extent cx="5303520" cy="3977640"/>
-            <wp:docPr id="5" name="Picture 5"/>
+            <wp:docPr id="6" name="Picture 6"/>
             <wp:cNvGraphicFramePr>
               <a:graphicFrameLocks noChangeAspect="1"/>
             </wp:cNvGraphicFramePr>
@@ -358,7 +422,7 @@
                     <pic:cNvPicPr/>
                   </pic:nvPicPr>
                   <pic:blipFill>
-                    <a:blip r:embed="rId14"/>
+                    <a:blip r:embed="rId15"/>
                     <a:stretch>
                       <a:fillRect/>
                     </a:stretch>
@@ -386,7 +450,7 @@
           <w:i/>
           <w:sz w:val="18"/>
         </w:rPr>
-        <w:t>Figure 5. Correlation heatmap for the dataset.</w:t>
+        <w:t>Figure 6. Correlation heatmap for the dataset.</w:t>
       </w:r>
     </w:p>
     <w:p>
@@ -670,7 +734,7 @@
         <w:drawing>
           <wp:inline xmlns:a="http://schemas.openxmlformats.org/drawingml/2006/main" xmlns:pic="http://schemas.openxmlformats.org/drawingml/2006/picture">
             <wp:extent cx="5303520" cy="4242816"/>
-            <wp:docPr id="6" name="Picture 6"/>
+            <wp:docPr id="7" name="Picture 7"/>
             <wp:cNvGraphicFramePr>
               <a:graphicFrameLocks noChangeAspect="1"/>
             </wp:cNvGraphicFramePr>
@@ -679,57 +743,6 @@
                 <pic:pic>
                   <pic:nvPicPr>
                     <pic:cNvPr id="0" name="confusion_matrix_logistic_regression.png"/>
-                    <pic:cNvPicPr/>
-                  </pic:nvPicPr>
-                  <pic:blipFill>
-                    <a:blip r:embed="rId15"/>
-                    <a:stretch>
-                      <a:fillRect/>
-                    </a:stretch>
-                  </pic:blipFill>
-                  <pic:spPr>
-                    <a:xfrm>
-                      <a:off x="0" y="0"/>
-                      <a:ext cx="5303520" cy="4242816"/>
-                    </a:xfrm>
-                    <a:prstGeom prst="rect"/>
-                  </pic:spPr>
-                </pic:pic>
-              </a:graphicData>
-            </a:graphic>
-          </wp:inline>
-        </w:drawing>
-      </w:r>
-    </w:p>
-    <w:p>
-      <w:pPr>
-        <w:jc w:val="center"/>
-      </w:pPr>
-      <w:r>
-        <w:rPr>
-          <w:i/>
-          <w:sz w:val="18"/>
-        </w:rPr>
-        <w:t>Figure 6. Confusion matrix for Logistic Regression.</w:t>
-      </w:r>
-    </w:p>
-    <w:p>
-      <w:pPr>
-        <w:jc w:val="center"/>
-      </w:pPr>
-      <w:r>
-        <w:drawing>
-          <wp:inline xmlns:a="http://schemas.openxmlformats.org/drawingml/2006/main" xmlns:pic="http://schemas.openxmlformats.org/drawingml/2006/picture">
-            <wp:extent cx="5303520" cy="4242816"/>
-            <wp:docPr id="7" name="Picture 7"/>
-            <wp:cNvGraphicFramePr>
-              <a:graphicFrameLocks noChangeAspect="1"/>
-            </wp:cNvGraphicFramePr>
-            <a:graphic>
-              <a:graphicData uri="http://schemas.openxmlformats.org/drawingml/2006/picture">
-                <pic:pic>
-                  <pic:nvPicPr>
-                    <pic:cNvPr id="0" name="confusion_matrix_random_forest.png"/>
                     <pic:cNvPicPr/>
                   </pic:nvPicPr>
                   <pic:blipFill>
@@ -761,7 +774,58 @@
           <w:i/>
           <w:sz w:val="18"/>
         </w:rPr>
-        <w:t>Figure 7. Confusion matrix for Random Forest.</w:t>
+        <w:t>Figure 7. Confusion matrix for Logistic Regression.</w:t>
+      </w:r>
+    </w:p>
+    <w:p>
+      <w:pPr>
+        <w:jc w:val="center"/>
+      </w:pPr>
+      <w:r>
+        <w:drawing>
+          <wp:inline xmlns:a="http://schemas.openxmlformats.org/drawingml/2006/main" xmlns:pic="http://schemas.openxmlformats.org/drawingml/2006/picture">
+            <wp:extent cx="5303520" cy="4242816"/>
+            <wp:docPr id="8" name="Picture 8"/>
+            <wp:cNvGraphicFramePr>
+              <a:graphicFrameLocks noChangeAspect="1"/>
+            </wp:cNvGraphicFramePr>
+            <a:graphic>
+              <a:graphicData uri="http://schemas.openxmlformats.org/drawingml/2006/picture">
+                <pic:pic>
+                  <pic:nvPicPr>
+                    <pic:cNvPr id="0" name="confusion_matrix_random_forest.png"/>
+                    <pic:cNvPicPr/>
+                  </pic:nvPicPr>
+                  <pic:blipFill>
+                    <a:blip r:embed="rId17"/>
+                    <a:stretch>
+                      <a:fillRect/>
+                    </a:stretch>
+                  </pic:blipFill>
+                  <pic:spPr>
+                    <a:xfrm>
+                      <a:off x="0" y="0"/>
+                      <a:ext cx="5303520" cy="4242816"/>
+                    </a:xfrm>
+                    <a:prstGeom prst="rect"/>
+                  </pic:spPr>
+                </pic:pic>
+              </a:graphicData>
+            </a:graphic>
+          </wp:inline>
+        </w:drawing>
+      </w:r>
+    </w:p>
+    <w:p>
+      <w:pPr>
+        <w:jc w:val="center"/>
+      </w:pPr>
+      <w:r>
+        <w:rPr>
+          <w:i/>
+          <w:sz w:val="18"/>
+        </w:rPr>
+        <w:t>Figure 8. Confusion matrix for Random Forest.</w:t>
       </w:r>
     </w:p>
     <w:p>
@@ -785,7 +849,7 @@
         <w:drawing>
           <wp:inline xmlns:a="http://schemas.openxmlformats.org/drawingml/2006/main" xmlns:pic="http://schemas.openxmlformats.org/drawingml/2006/picture">
             <wp:extent cx="5303520" cy="2488906"/>
-            <wp:docPr id="8" name="Picture 8"/>
+            <wp:docPr id="9" name="Picture 9"/>
             <wp:cNvGraphicFramePr>
               <a:graphicFrameLocks noChangeAspect="1"/>
             </wp:cNvGraphicFramePr>
@@ -797,7 +861,7 @@
                     <pic:cNvPicPr/>
                   </pic:nvPicPr>
                   <pic:blipFill>
-                    <a:blip r:embed="rId17"/>
+                    <a:blip r:embed="rId18"/>
                     <a:stretch>
                       <a:fillRect/>
                     </a:stretch>
@@ -825,7 +889,7 @@
           <w:i/>
           <w:sz w:val="18"/>
         </w:rPr>
-        <w:t>Figure 8. MLflow experiment runs.</w:t>
+        <w:t>Figure 9. MLflow experiment runs.</w:t>
       </w:r>
     </w:p>
     <w:p>
@@ -836,7 +900,7 @@
         <w:drawing>
           <wp:inline xmlns:a="http://schemas.openxmlformats.org/drawingml/2006/main" xmlns:pic="http://schemas.openxmlformats.org/drawingml/2006/picture">
             <wp:extent cx="5303520" cy="2859802"/>
-            <wp:docPr id="9" name="Picture 9"/>
+            <wp:docPr id="10" name="Picture 10"/>
             <wp:cNvGraphicFramePr>
               <a:graphicFrameLocks noChangeAspect="1"/>
             </wp:cNvGraphicFramePr>
@@ -848,7 +912,7 @@
                     <pic:cNvPicPr/>
                   </pic:nvPicPr>
                   <pic:blipFill>
-                    <a:blip r:embed="rId18"/>
+                    <a:blip r:embed="rId19"/>
                     <a:stretch>
                       <a:fillRect/>
                     </a:stretch>
@@ -876,7 +940,7 @@
           <w:i/>
           <w:sz w:val="18"/>
         </w:rPr>
-        <w:t>Figure 9. MLflow run details and logged values.</w:t>
+        <w:t>Figure 10. MLflow run details and logged values.</w:t>
       </w:r>
     </w:p>
     <w:p>
@@ -905,7 +969,7 @@
         <w:drawing>
           <wp:inline xmlns:a="http://schemas.openxmlformats.org/drawingml/2006/main" xmlns:pic="http://schemas.openxmlformats.org/drawingml/2006/picture">
             <wp:extent cx="5303520" cy="1137576"/>
-            <wp:docPr id="10" name="Picture 10"/>
+            <wp:docPr id="11" name="Picture 11"/>
             <wp:cNvGraphicFramePr>
               <a:graphicFrameLocks noChangeAspect="1"/>
             </wp:cNvGraphicFramePr>
@@ -917,7 +981,7 @@
                     <pic:cNvPicPr/>
                   </pic:nvPicPr>
                   <pic:blipFill>
-                    <a:blip r:embed="rId19"/>
+                    <a:blip r:embed="rId20"/>
                     <a:stretch>
                       <a:fillRect/>
                     </a:stretch>
@@ -945,7 +1009,7 @@
           <w:i/>
           <w:sz w:val="18"/>
         </w:rPr>
-        <w:t>Figure 10. Example prediction response from the containerized API.</w:t>
+        <w:t>Figure 11. Example prediction response from the containerized API.</w:t>
       </w:r>
     </w:p>
     <w:p>
@@ -956,7 +1020,7 @@
         <w:drawing>
           <wp:inline xmlns:a="http://schemas.openxmlformats.org/drawingml/2006/main" xmlns:pic="http://schemas.openxmlformats.org/drawingml/2006/picture">
             <wp:extent cx="5303520" cy="1084881"/>
-            <wp:docPr id="11" name="Picture 11"/>
+            <wp:docPr id="12" name="Picture 12"/>
             <wp:cNvGraphicFramePr>
               <a:graphicFrameLocks noChangeAspect="1"/>
             </wp:cNvGraphicFramePr>
@@ -968,7 +1032,7 @@
                     <pic:cNvPicPr/>
                   </pic:nvPicPr>
                   <pic:blipFill>
-                    <a:blip r:embed="rId20"/>
+                    <a:blip r:embed="rId21"/>
                     <a:stretch>
                       <a:fillRect/>
                     </a:stretch>
@@ -996,7 +1060,7 @@
           <w:i/>
           <w:sz w:val="18"/>
         </w:rPr>
-        <w:t>Figure 11. Example prediction response through Kubernetes ingress.</w:t>
+        <w:t>Figure 12. Example prediction response through Kubernetes ingress.</w:t>
       </w:r>
     </w:p>
     <w:p>
@@ -1025,7 +1089,7 @@
         <w:drawing>
           <wp:inline xmlns:a="http://schemas.openxmlformats.org/drawingml/2006/main" xmlns:pic="http://schemas.openxmlformats.org/drawingml/2006/picture">
             <wp:extent cx="5303520" cy="2983230"/>
-            <wp:docPr id="12" name="Picture 12"/>
+            <wp:docPr id="13" name="Picture 13"/>
             <wp:cNvGraphicFramePr>
               <a:graphicFrameLocks noChangeAspect="1"/>
             </wp:cNvGraphicFramePr>
@@ -1037,7 +1101,7 @@
                     <pic:cNvPicPr/>
                   </pic:nvPicPr>
                   <pic:blipFill>
-                    <a:blip r:embed="rId21"/>
+                    <a:blip r:embed="rId22"/>
                     <a:stretch>
                       <a:fillRect/>
                     </a:stretch>
@@ -1065,7 +1129,7 @@
           <w:i/>
           <w:sz w:val="18"/>
         </w:rPr>
-        <w:t>Figure 12. GitHub Actions workflow evidence.</w:t>
+        <w:t>Figure 13. GitHub Actions workflow evidence.</w:t>
       </w:r>
     </w:p>
     <w:p>
@@ -1089,7 +1153,7 @@
         <w:drawing>
           <wp:inline xmlns:a="http://schemas.openxmlformats.org/drawingml/2006/main" xmlns:pic="http://schemas.openxmlformats.org/drawingml/2006/picture">
             <wp:extent cx="5303520" cy="448872"/>
-            <wp:docPr id="13" name="Picture 13"/>
+            <wp:docPr id="14" name="Picture 14"/>
             <wp:cNvGraphicFramePr>
               <a:graphicFrameLocks noChangeAspect="1"/>
             </wp:cNvGraphicFramePr>
@@ -1101,7 +1165,7 @@
                     <pic:cNvPicPr/>
                   </pic:nvPicPr>
                   <pic:blipFill>
-                    <a:blip r:embed="rId22"/>
+                    <a:blip r:embed="rId23"/>
                     <a:stretch>
                       <a:fillRect/>
                     </a:stretch>
@@ -1129,7 +1193,7 @@
           <w:i/>
           <w:sz w:val="18"/>
         </w:rPr>
-        <w:t>Figure 13. Docker image build evidence.</w:t>
+        <w:t>Figure 14. Docker image build evidence.</w:t>
       </w:r>
     </w:p>
     <w:p>
@@ -1145,7 +1209,7 @@
         <w:drawing>
           <wp:inline xmlns:a="http://schemas.openxmlformats.org/drawingml/2006/main" xmlns:pic="http://schemas.openxmlformats.org/drawingml/2006/picture">
             <wp:extent cx="5303520" cy="844731"/>
-            <wp:docPr id="14" name="Picture 14"/>
+            <wp:docPr id="15" name="Picture 15"/>
             <wp:cNvGraphicFramePr>
               <a:graphicFrameLocks noChangeAspect="1"/>
             </wp:cNvGraphicFramePr>
@@ -1157,7 +1221,7 @@
                     <pic:cNvPicPr/>
                   </pic:nvPicPr>
                   <pic:blipFill>
-                    <a:blip r:embed="rId23"/>
+                    <a:blip r:embed="rId24"/>
                     <a:stretch>
                       <a:fillRect/>
                     </a:stretch>
@@ -1185,7 +1249,7 @@
           <w:i/>
           <w:sz w:val="18"/>
         </w:rPr>
-        <w:t>Figure 14. Kubernetes resources and deployment status.</w:t>
+        <w:t>Figure 15. Kubernetes resources and deployment status.</w:t>
       </w:r>
     </w:p>
     <w:p>
@@ -1209,7 +1273,7 @@
         <w:drawing>
           <wp:inline xmlns:a="http://schemas.openxmlformats.org/drawingml/2006/main" xmlns:pic="http://schemas.openxmlformats.org/drawingml/2006/picture">
             <wp:extent cx="5303520" cy="1243883"/>
-            <wp:docPr id="15" name="Picture 15"/>
+            <wp:docPr id="16" name="Picture 16"/>
             <wp:cNvGraphicFramePr>
               <a:graphicFrameLocks noChangeAspect="1"/>
             </wp:cNvGraphicFramePr>
@@ -1221,7 +1285,7 @@
                     <pic:cNvPicPr/>
                   </pic:nvPicPr>
                   <pic:blipFill>
-                    <a:blip r:embed="rId24"/>
+                    <a:blip r:embed="rId25"/>
                     <a:stretch>
                       <a:fillRect/>
                     </a:stretch>
@@ -1249,7 +1313,7 @@
           <w:i/>
           <w:sz w:val="18"/>
         </w:rPr>
-        <w:t>Figure 15. Prometheus metrics exposed by the API.</w:t>
+        <w:t>Figure 16. Prometheus metrics exposed by the API.</w:t>
       </w:r>
     </w:p>
     <w:p>
@@ -1260,7 +1324,7 @@
         <w:drawing>
           <wp:inline xmlns:a="http://schemas.openxmlformats.org/drawingml/2006/main" xmlns:pic="http://schemas.openxmlformats.org/drawingml/2006/picture">
             <wp:extent cx="5303520" cy="1950684"/>
-            <wp:docPr id="16" name="Picture 16"/>
+            <wp:docPr id="17" name="Picture 17"/>
             <wp:cNvGraphicFramePr>
               <a:graphicFrameLocks noChangeAspect="1"/>
             </wp:cNvGraphicFramePr>
@@ -1272,7 +1336,7 @@
                     <pic:cNvPicPr/>
                   </pic:nvPicPr>
                   <pic:blipFill>
-                    <a:blip r:embed="rId25"/>
+                    <a:blip r:embed="rId26"/>
                     <a:stretch>
                       <a:fillRect/>
                     </a:stretch>
@@ -1300,7 +1364,7 @@
           <w:i/>
           <w:sz w:val="18"/>
         </w:rPr>
-        <w:t>Figure 16. Application monitoring dashboard.</w:t>
+        <w:t>Figure 17. Application monitoring dashboard.</w:t>
       </w:r>
     </w:p>
     <w:p>
@@ -1368,70 +1432,6 @@
     <w:p>
       <w:r>
         <w:t>The screenshots referenced in this report are maintained under the repository's screenshots/ directory. The EDA and confusion-matrix figures are maintained under reports/figures/. Consult README.md for exact commands, configuration, and local deployment instructions.</w:t>
-      </w:r>
-    </w:p>
-    <w:p>
-      <w:pPr>
-        <w:pStyle w:val="Heading1"/>
-      </w:pPr>
-      <w:r>
-        <w:t>Architecture</w:t>
-      </w:r>
-    </w:p>
-    <w:p>
-      <w:r>
-        <w:t>The diagram below summarizes the data, training, experiment tracking, API serving, CI/CD, container deployment and monitoring workflow.</w:t>
-      </w:r>
-    </w:p>
-    <w:p>
-      <w:pPr>
-        <w:jc w:val="center"/>
-      </w:pPr>
-      <w:r>
-        <w:drawing>
-          <wp:inline xmlns:a="http://schemas.openxmlformats.org/drawingml/2006/main" xmlns:pic="http://schemas.openxmlformats.org/drawingml/2006/picture">
-            <wp:extent cx="5486400" cy="2811780"/>
-            <wp:docPr id="17" name="Picture 17"/>
-            <wp:cNvGraphicFramePr>
-              <a:graphicFrameLocks noChangeAspect="1"/>
-            </wp:cNvGraphicFramePr>
-            <a:graphic>
-              <a:graphicData uri="http://schemas.openxmlformats.org/drawingml/2006/picture">
-                <pic:pic>
-                  <pic:nvPicPr>
-                    <pic:cNvPr id="0" name="architecture_diagram.png"/>
-                    <pic:cNvPicPr/>
-                  </pic:nvPicPr>
-                  <pic:blipFill>
-                    <a:blip r:embed="rId26"/>
-                    <a:stretch>
-                      <a:fillRect/>
-                    </a:stretch>
-                  </pic:blipFill>
-                  <pic:spPr>
-                    <a:xfrm>
-                      <a:off x="0" y="0"/>
-                      <a:ext cx="5486400" cy="2811780"/>
-                    </a:xfrm>
-                    <a:prstGeom prst="rect"/>
-                  </pic:spPr>
-                </pic:pic>
-              </a:graphicData>
-            </a:graphic>
-          </wp:inline>
-        </w:drawing>
-      </w:r>
-    </w:p>
-    <w:p>
-      <w:pPr>
-        <w:jc w:val="center"/>
-      </w:pPr>
-      <w:r>
-        <w:rPr>
-          <w:i/>
-          <w:sz w:val="18"/>
-        </w:rPr>
-        <w:t>Figure 17. End-to-end architecture of the implemented MLOps workflow.</w:t>
       </w:r>
     </w:p>
     <w:sectPr>

</xml_diff>